<commit_message>
fix: publish latest CV document
</commit_message>
<xml_diff>
--- a/frontend/public/assets/CV_Afif_2026.docx
+++ b/frontend/public/assets/CV_Afif_2026.docx
@@ -59,11 +59,11 @@
     </w:p>
     <w:p>
       <w:pPr>
-        <w:spacing w:line="240" w:lineRule="auto"/>
+        <w:spacing w:after="0" w:line="240" w:lineRule="auto"/>
         <w:jc w:val="center"/>
         <w:rPr>
-          <w:rFonts w:cstheme="minorHAnsi"/>
-          <w:b/>
+          <w:rStyle w:val="Hyperlink"/>
+          <w:rFonts w:cstheme="minorHAnsi"/>
           <w:sz w:val="24"/>
           <w:szCs w:val="28"/>
         </w:rPr>
@@ -103,6 +103,27 @@
     </w:p>
     <w:p>
       <w:pPr>
+        <w:spacing w:line="240" w:lineRule="auto"/>
+        <w:jc w:val="center"/>
+        <w:rPr>
+          <w:rFonts w:cstheme="minorHAnsi"/>
+          <w:b/>
+          <w:sz w:val="28"/>
+          <w:szCs w:val="28"/>
+        </w:rPr>
+      </w:pPr>
+      <w:hyperlink r:id="rId8" w:history="1">
+        <w:r>
+          <w:rPr>
+            <w:rStyle w:val="Hyperlink"/>
+            <w:sz w:val="24"/>
+          </w:rPr>
+          <w:t>https://alafif-abdurrahman.vercel.app</w:t>
+        </w:r>
+      </w:hyperlink>
+    </w:p>
+    <w:p>
+      <w:pPr>
         <w:pBdr>
           <w:bottom w:val="single" w:sz="12" w:space="1" w:color="auto"/>
         </w:pBdr>
@@ -126,25 +147,32 @@
     </w:p>
     <w:p>
       <w:pPr>
-        <w:pStyle w:val="NormalWeb"/>
-        <w:spacing w:before="0" w:beforeAutospacing="0"/>
-        <w:jc w:val="both"/>
-        <w:rPr>
-          <w:rFonts w:asciiTheme="minorHAnsi" w:eastAsiaTheme="minorHAnsi" w:hAnsiTheme="minorHAnsi" w:cstheme="minorHAnsi"/>
-          <w:szCs w:val="28"/>
-          <w:lang w:eastAsia="en-US"/>
-        </w:rPr>
-      </w:pPr>
-      <w:r>
-        <w:rPr>
-          <w:rFonts w:asciiTheme="minorHAnsi" w:eastAsiaTheme="minorHAnsi" w:hAnsiTheme="minorHAnsi" w:cstheme="minorHAnsi"/>
-          <w:szCs w:val="28"/>
-          <w:lang w:eastAsia="en-US"/>
-        </w:rPr>
-        <w:t>Fresh Graduate Teknik Informatika yang berdedikasi dengan pengalaman praktis dalam bidang AI/ML Engineer, khususnya pada pengembangan solusi berbasis Machine Learning, Natural Language Processing, Retrieval-Augmented Generation, dan Large Language Model. Menguasai Python serta algoritma K-Means, CNN, dan SVM yang diintegrasikan dengan metode CRISP-DM untuk mendukung alur kerja analisis data yang sistematis. Memiliki fokus pada pengembangan model Machine Learning dan sistem berbasis LLM yang mampu menghasilkan insight bisnis, menemukan pola data, serta mendukung otomatisasi layanan melalui integrasi aplikasi web. Berkomitmen memberikan kontribusi nyata dalam tim pengembangan perangkat lunak dan data science yang dinamis.</w:t>
+        <w:spacing w:after="0" w:line="240" w:lineRule="auto"/>
+        <w:jc w:val="both"/>
+        <w:rPr>
+          <w:rFonts w:cstheme="minorHAnsi"/>
+          <w:sz w:val="24"/>
+          <w:szCs w:val="28"/>
+        </w:rPr>
+      </w:pPr>
+      <w:r>
+        <w:rPr>
+          <w:rFonts w:cstheme="minorHAnsi"/>
+          <w:sz w:val="24"/>
+          <w:szCs w:val="28"/>
+        </w:rPr>
+        <w:t>Mahasiswa S1 Teknik Informatika dengan IPK 3,90/4,00 yang memiliki minat dan pengalaman pada bidang Artificial Intelligence, Data Science, Web Development, serta IT Support. Berpengalaman dalam pengembangan solusi berbasis data dan AI, termasuk implementasi Retrieval-Augmented Generation (RAG), Large Language Model (LLM), Natural Language Processing (NLP), dan customer segmentation menggunakan machine learning. Memiliki pengalaman dalam pemeliharaan infrastruktur sistem, troubleshooting teknis, serta pengembangan aplikasi berbasis web. Selain kompe</w:t>
       </w:r>
       <w:bookmarkStart w:id="0" w:name="_GoBack"/>
       <w:bookmarkEnd w:id="0"/>
+      <w:r>
+        <w:rPr>
+          <w:rFonts w:cstheme="minorHAnsi"/>
+          <w:sz w:val="24"/>
+          <w:szCs w:val="28"/>
+        </w:rPr>
+        <w:t>tensi teknis, memiliki pengalaman kepemimpinan dalam organisasi mahasiswa, manajemen proyek, public speaking, dan kolaborasi tim. Terbiasa bekerja secara analitis, terstruktur, dan berorientasi pada problem solving untuk menghasilkan solusi yang efektif, inovatif, dan berdampak.</w:t>
+      </w:r>
     </w:p>
     <w:p>
       <w:pPr>
@@ -366,16 +394,7 @@
           <w:sz w:val="24"/>
           <w:szCs w:val="28"/>
         </w:rPr>
-        <w:t>|</w:t>
-      </w:r>
-      <w:r>
-        <w:rPr>
-          <w:rFonts w:cstheme="minorHAnsi"/>
-          <w:b/>
-          <w:sz w:val="24"/>
-          <w:szCs w:val="28"/>
-        </w:rPr>
-        <w:t xml:space="preserve"> Januari 2021 </w:t>
+        <w:t xml:space="preserve">| Januari 2021 </w:t>
       </w:r>
       <w:r>
         <w:rPr>
@@ -443,23 +462,7 @@
           <w:sz w:val="24"/>
           <w:szCs w:val="28"/>
         </w:rPr>
-        <w:t xml:space="preserve">Mengelola entri data administrasi kependudukan ke dalam sistem </w:t>
-      </w:r>
-      <w:r>
-        <w:rPr>
-          <w:rFonts w:cstheme="minorHAnsi"/>
-          <w:sz w:val="24"/>
-          <w:szCs w:val="28"/>
-        </w:rPr>
-        <w:t>SIAK</w:t>
-      </w:r>
-      <w:r>
-        <w:rPr>
-          <w:rFonts w:cstheme="minorHAnsi"/>
-          <w:sz w:val="24"/>
-          <w:szCs w:val="28"/>
-        </w:rPr>
-        <w:t xml:space="preserve"> dengan memastikan akurasi dan kelengkapan data.</w:t>
+        <w:t>Mengelola entri data administrasi kependudukan ke dalam sistem SIAK dengan memastikan akurasi dan kelengkapan data.</w:t>
       </w:r>
     </w:p>
     <w:p>
@@ -729,7 +732,7 @@
         </w:rPr>
         <w:t xml:space="preserve">Link Proyek: </w:t>
       </w:r>
-      <w:hyperlink r:id="rId8" w:history="1">
+      <w:hyperlink r:id="rId9" w:history="1">
         <w:r>
           <w:rPr>
             <w:rStyle w:val="Hyperlink"/>
@@ -744,25 +747,7 @@
             <w:sz w:val="24"/>
             <w:szCs w:val="28"/>
           </w:rPr>
-          <w:t>ttps://github.com/AlAfif19/</w:t>
-        </w:r>
-        <w:r>
-          <w:rPr>
-            <w:rStyle w:val="Hyperlink"/>
-            <w:rFonts w:cstheme="minorHAnsi"/>
-            <w:sz w:val="24"/>
-            <w:szCs w:val="28"/>
-          </w:rPr>
-          <w:t>RAGchatbot-desa.gi</w:t>
-        </w:r>
-        <w:r>
-          <w:rPr>
-            <w:rStyle w:val="Hyperlink"/>
-            <w:rFonts w:cstheme="minorHAnsi"/>
-            <w:sz w:val="24"/>
-            <w:szCs w:val="28"/>
-          </w:rPr>
-          <w:t>t</w:t>
+          <w:t>ttps://github.com/AlAfif19/RAGchatbot-desa.git</w:t>
         </w:r>
       </w:hyperlink>
     </w:p>
@@ -933,7 +918,7 @@
         </w:rPr>
         <w:t xml:space="preserve">Link Proyek: </w:t>
       </w:r>
-      <w:hyperlink r:id="rId9" w:history="1">
+      <w:hyperlink r:id="rId10" w:history="1">
         <w:r>
           <w:rPr>
             <w:rStyle w:val="Hyperlink"/>
@@ -1240,31 +1225,6 @@
     </w:p>
     <w:p>
       <w:pPr>
-        <w:pStyle w:val="ListParagraph"/>
-        <w:numPr>
-          <w:ilvl w:val="0"/>
-          <w:numId w:val="1"/>
-        </w:numPr>
-        <w:spacing w:after="0" w:line="240" w:lineRule="auto"/>
-        <w:ind w:left="284" w:hanging="284"/>
-        <w:jc w:val="both"/>
-        <w:rPr>
-          <w:rFonts w:cstheme="minorHAnsi"/>
-          <w:sz w:val="24"/>
-          <w:szCs w:val="28"/>
-        </w:rPr>
-      </w:pPr>
-      <w:r>
-        <w:rPr>
-          <w:rFonts w:cstheme="minorHAnsi"/>
-          <w:sz w:val="24"/>
-          <w:szCs w:val="28"/>
-        </w:rPr>
-        <w:t>Berkolaborasi dengan berbagai organisasi mahasiswa dalam mendukung terciptanya sistem organisasi yang transparan, akuntabel, dan terstruktur.</w:t>
-      </w:r>
-    </w:p>
-    <w:p>
-      <w:pPr>
         <w:spacing w:after="0" w:line="240" w:lineRule="auto"/>
         <w:jc w:val="both"/>
         <w:rPr>
@@ -1295,16 +1255,7 @@
           <w:sz w:val="24"/>
           <w:szCs w:val="24"/>
         </w:rPr>
-        <w:t xml:space="preserve">Ketua </w:t>
-      </w:r>
-      <w:r>
-        <w:rPr>
-          <w:rFonts w:cstheme="minorHAnsi"/>
-          <w:b/>
-          <w:sz w:val="24"/>
-          <w:szCs w:val="24"/>
-        </w:rPr>
-        <w:t>Pelaksana</w:t>
+        <w:t>Ketua Pelaksana</w:t>
       </w:r>
       <w:r>
         <w:rPr>
@@ -1322,16 +1273,7 @@
           <w:sz w:val="24"/>
           <w:szCs w:val="24"/>
         </w:rPr>
-        <w:t>IT X FAIR HMIF UKRI</w:t>
-      </w:r>
-      <w:r>
-        <w:rPr>
-          <w:rFonts w:cstheme="minorHAnsi"/>
-          <w:b/>
-          <w:sz w:val="24"/>
-          <w:szCs w:val="24"/>
-        </w:rPr>
-        <w:t xml:space="preserve"> </w:t>
+        <w:t xml:space="preserve">IT X FAIR HMIF UKRI </w:t>
       </w:r>
       <w:r>
         <w:rPr>
@@ -1349,25 +1291,7 @@
           <w:sz w:val="24"/>
           <w:szCs w:val="24"/>
         </w:rPr>
-        <w:t>Juli</w:t>
-      </w:r>
-      <w:r>
-        <w:rPr>
-          <w:rFonts w:cstheme="minorHAnsi"/>
-          <w:b/>
-          <w:sz w:val="24"/>
-          <w:szCs w:val="24"/>
-        </w:rPr>
-        <w:t xml:space="preserve"> 202</w:t>
-      </w:r>
-      <w:r>
-        <w:rPr>
-          <w:rFonts w:cstheme="minorHAnsi"/>
-          <w:b/>
-          <w:sz w:val="24"/>
-          <w:szCs w:val="24"/>
-        </w:rPr>
-        <w:t>4</w:t>
+        <w:t>Juli 2024</w:t>
       </w:r>
     </w:p>
     <w:p>
@@ -1527,7 +1451,7 @@
           <w:sz w:val="24"/>
           <w:szCs w:val="24"/>
         </w:rPr>
-        <w:t>Ketua Pelaksana</w:t>
+        <w:t>Speaker – Voyage of Discovery</w:t>
       </w:r>
       <w:r>
         <w:rPr>
@@ -1545,7 +1469,7 @@
           <w:sz w:val="24"/>
           <w:szCs w:val="24"/>
         </w:rPr>
-        <w:t xml:space="preserve">IT X FAIR HMIF UKRI </w:t>
+        <w:t>Association of English Literature</w:t>
       </w:r>
       <w:r>
         <w:rPr>
@@ -1563,132 +1487,107 @@
           <w:sz w:val="24"/>
           <w:szCs w:val="24"/>
         </w:rPr>
-        <w:t>Juli 2024</w:t>
-      </w:r>
-    </w:p>
-    <w:p>
-      <w:pPr>
-        <w:pStyle w:val="ListParagraph"/>
-        <w:numPr>
-          <w:ilvl w:val="0"/>
-          <w:numId w:val="1"/>
-        </w:numPr>
-        <w:spacing w:after="0" w:line="240" w:lineRule="auto"/>
-        <w:ind w:left="284" w:hanging="284"/>
-        <w:jc w:val="both"/>
-        <w:rPr>
-          <w:rFonts w:cstheme="minorHAnsi"/>
-          <w:sz w:val="24"/>
-          <w:szCs w:val="28"/>
-        </w:rPr>
-      </w:pPr>
-      <w:r>
-        <w:rPr>
-          <w:rFonts w:cstheme="minorHAnsi"/>
-          <w:sz w:val="24"/>
-          <w:szCs w:val="28"/>
-        </w:rPr>
-        <w:t>Memimpin perencanaan dan pelaksanaan kegiatan secara menyeluruh mulai dari tahap perencanaan, eksekusi, hingga pelaporan pertanggungjawaban.</w:t>
-      </w:r>
-    </w:p>
-    <w:p>
-      <w:pPr>
-        <w:pStyle w:val="ListParagraph"/>
-        <w:numPr>
-          <w:ilvl w:val="0"/>
-          <w:numId w:val="1"/>
-        </w:numPr>
-        <w:spacing w:after="0" w:line="240" w:lineRule="auto"/>
-        <w:ind w:left="284" w:hanging="284"/>
-        <w:jc w:val="both"/>
-        <w:rPr>
-          <w:rFonts w:cstheme="minorHAnsi"/>
-          <w:sz w:val="24"/>
-          <w:szCs w:val="28"/>
-        </w:rPr>
-      </w:pPr>
-      <w:r>
-        <w:rPr>
-          <w:rFonts w:cstheme="minorHAnsi"/>
-          <w:sz w:val="24"/>
-          <w:szCs w:val="28"/>
-        </w:rPr>
-        <w:t>Menyusun timeline kegiatan, target pencapaian, serta strategi pelaksanaan untuk memastikan seluruh rangkaian acara berjalan sesuai rencana.</w:t>
-      </w:r>
-    </w:p>
-    <w:p>
-      <w:pPr>
-        <w:pStyle w:val="ListParagraph"/>
-        <w:numPr>
-          <w:ilvl w:val="0"/>
-          <w:numId w:val="1"/>
-        </w:numPr>
-        <w:spacing w:after="0" w:line="240" w:lineRule="auto"/>
-        <w:ind w:left="284" w:hanging="284"/>
-        <w:jc w:val="both"/>
-        <w:rPr>
-          <w:rFonts w:cstheme="minorHAnsi"/>
-          <w:sz w:val="24"/>
-          <w:szCs w:val="28"/>
-        </w:rPr>
-      </w:pPr>
-      <w:r>
-        <w:rPr>
-          <w:rFonts w:cstheme="minorHAnsi"/>
-          <w:sz w:val="24"/>
-          <w:szCs w:val="28"/>
-        </w:rPr>
-        <w:t>Merancang rangkaian kegiatan yang mencakup kunjungan sosial ke panti asuhan, sesi seminar/pematerian, dan ceremony Dies Natalis Himpunan IT UKRI.</w:t>
-      </w:r>
-    </w:p>
-    <w:p>
-      <w:pPr>
-        <w:pStyle w:val="ListParagraph"/>
-        <w:numPr>
-          <w:ilvl w:val="0"/>
-          <w:numId w:val="1"/>
-        </w:numPr>
-        <w:spacing w:after="0" w:line="240" w:lineRule="auto"/>
-        <w:ind w:left="284" w:hanging="284"/>
-        <w:jc w:val="both"/>
-        <w:rPr>
-          <w:rFonts w:cstheme="minorHAnsi"/>
-          <w:sz w:val="24"/>
-          <w:szCs w:val="28"/>
-        </w:rPr>
-      </w:pPr>
-      <w:r>
-        <w:rPr>
-          <w:rFonts w:cstheme="minorHAnsi"/>
-          <w:sz w:val="24"/>
-          <w:szCs w:val="28"/>
-        </w:rPr>
-        <w:t>Mengkoordinasikan seluruh divisi pelaksana agar setiap job desk dan target kerja terlaksana secara efektif.</w:t>
-      </w:r>
-    </w:p>
-    <w:p>
-      <w:pPr>
-        <w:pStyle w:val="ListParagraph"/>
-        <w:numPr>
-          <w:ilvl w:val="0"/>
-          <w:numId w:val="1"/>
-        </w:numPr>
-        <w:spacing w:after="0" w:line="240" w:lineRule="auto"/>
-        <w:ind w:left="284" w:hanging="284"/>
-        <w:jc w:val="both"/>
-        <w:rPr>
-          <w:rFonts w:cstheme="minorHAnsi"/>
-          <w:sz w:val="24"/>
-          <w:szCs w:val="28"/>
-        </w:rPr>
-      </w:pPr>
-      <w:r>
-        <w:rPr>
-          <w:rFonts w:cstheme="minorHAnsi"/>
-          <w:sz w:val="24"/>
-          <w:szCs w:val="28"/>
-        </w:rPr>
-        <w:t>Melakukan monitoring dan evaluasi pelaksanaan kegiatan guna memastikan acara berjalan lancar, tepat waktu, dan sesuai tujuan.</w:t>
+        <w:t>November 2025</w:t>
+      </w:r>
+    </w:p>
+    <w:p>
+      <w:pPr>
+        <w:pStyle w:val="ListParagraph"/>
+        <w:numPr>
+          <w:ilvl w:val="0"/>
+          <w:numId w:val="1"/>
+        </w:numPr>
+        <w:spacing w:after="0" w:line="240" w:lineRule="auto"/>
+        <w:ind w:left="284" w:hanging="284"/>
+        <w:jc w:val="both"/>
+        <w:rPr>
+          <w:rFonts w:cstheme="minorHAnsi"/>
+          <w:sz w:val="24"/>
+          <w:szCs w:val="28"/>
+        </w:rPr>
+      </w:pPr>
+      <w:r>
+        <w:rPr>
+          <w:rFonts w:cstheme="minorHAnsi"/>
+          <w:sz w:val="24"/>
+          <w:szCs w:val="28"/>
+        </w:rPr>
+        <w:t>Menjadi pembicara dalam kegiatan Voyage of Discovery yang dihadiri oleh mahasiswa Sastra Inggris.</w:t>
+      </w:r>
+    </w:p>
+    <w:p>
+      <w:pPr>
+        <w:pStyle w:val="ListParagraph"/>
+        <w:numPr>
+          <w:ilvl w:val="0"/>
+          <w:numId w:val="1"/>
+        </w:numPr>
+        <w:spacing w:after="0" w:line="240" w:lineRule="auto"/>
+        <w:ind w:left="284" w:hanging="284"/>
+        <w:jc w:val="both"/>
+        <w:rPr>
+          <w:rFonts w:cstheme="minorHAnsi"/>
+          <w:sz w:val="24"/>
+          <w:szCs w:val="28"/>
+        </w:rPr>
+      </w:pPr>
+      <w:r>
+        <w:rPr>
+          <w:rFonts w:cstheme="minorHAnsi"/>
+          <w:sz w:val="24"/>
+          <w:szCs w:val="28"/>
+        </w:rPr>
+        <w:t>Menyampaikan materi secara interaktif terkait topik pengembangan wawasan, akademik, dan pengenalan dunia profesional.</w:t>
+      </w:r>
+    </w:p>
+    <w:p>
+      <w:pPr>
+        <w:pStyle w:val="ListParagraph"/>
+        <w:numPr>
+          <w:ilvl w:val="0"/>
+          <w:numId w:val="1"/>
+        </w:numPr>
+        <w:spacing w:after="0" w:line="240" w:lineRule="auto"/>
+        <w:ind w:left="284" w:hanging="284"/>
+        <w:jc w:val="both"/>
+        <w:rPr>
+          <w:rFonts w:cstheme="minorHAnsi"/>
+          <w:sz w:val="24"/>
+          <w:szCs w:val="28"/>
+        </w:rPr>
+      </w:pPr>
+      <w:r>
+        <w:rPr>
+          <w:rFonts w:cstheme="minorHAnsi"/>
+          <w:sz w:val="24"/>
+          <w:szCs w:val="28"/>
+        </w:rPr>
+        <w:t>Membangun komunikasi dua arah dengan peserta melalui sesi diskusi dan tanya jawab untuk meningkatkan pemahaman materi.</w:t>
+      </w:r>
+    </w:p>
+    <w:p>
+      <w:pPr>
+        <w:pStyle w:val="ListParagraph"/>
+        <w:numPr>
+          <w:ilvl w:val="0"/>
+          <w:numId w:val="1"/>
+        </w:numPr>
+        <w:spacing w:after="0" w:line="240" w:lineRule="auto"/>
+        <w:ind w:left="284" w:hanging="284"/>
+        <w:jc w:val="both"/>
+        <w:rPr>
+          <w:rFonts w:cstheme="minorHAnsi"/>
+          <w:sz w:val="24"/>
+          <w:szCs w:val="28"/>
+        </w:rPr>
+      </w:pPr>
+      <w:r>
+        <w:rPr>
+          <w:rFonts w:cstheme="minorHAnsi"/>
+          <w:sz w:val="24"/>
+          <w:szCs w:val="28"/>
+        </w:rPr>
+        <w:t>Berkontribusi dalam menciptakan suasana pembelajaran yang aktif, inspiratif, dan kolaboratif.</w:t>
       </w:r>
     </w:p>
     <w:p>
@@ -1723,7 +1622,7 @@
           <w:sz w:val="24"/>
           <w:szCs w:val="24"/>
         </w:rPr>
-        <w:t>Ketua Pelaksana</w:t>
+        <w:t>Performer Artist</w:t>
       </w:r>
       <w:r>
         <w:rPr>
@@ -1741,7 +1640,7 @@
           <w:sz w:val="24"/>
           <w:szCs w:val="24"/>
         </w:rPr>
-        <w:t xml:space="preserve">IT X FAIR HMIF UKRI </w:t>
+        <w:t>Open House Teater Lima Wajah</w:t>
       </w:r>
       <w:r>
         <w:rPr>
@@ -1759,435 +1658,7 @@
           <w:sz w:val="24"/>
           <w:szCs w:val="24"/>
         </w:rPr>
-        <w:t>Juli 2024</w:t>
-      </w:r>
-    </w:p>
-    <w:p>
-      <w:pPr>
-        <w:pStyle w:val="ListParagraph"/>
-        <w:numPr>
-          <w:ilvl w:val="0"/>
-          <w:numId w:val="1"/>
-        </w:numPr>
-        <w:spacing w:after="0" w:line="240" w:lineRule="auto"/>
-        <w:ind w:left="284" w:hanging="284"/>
-        <w:jc w:val="both"/>
-        <w:rPr>
-          <w:rFonts w:cstheme="minorHAnsi"/>
-          <w:sz w:val="24"/>
-          <w:szCs w:val="28"/>
-        </w:rPr>
-      </w:pPr>
-      <w:r>
-        <w:rPr>
-          <w:rFonts w:cstheme="minorHAnsi"/>
-          <w:sz w:val="24"/>
-          <w:szCs w:val="28"/>
-        </w:rPr>
-        <w:t>Memimpin perencanaan dan pelaksanaan kegiatan secara menyeluruh mulai dari tahap perencanaan, eksekusi, hingga pelaporan pertanggungjawaban.</w:t>
-      </w:r>
-    </w:p>
-    <w:p>
-      <w:pPr>
-        <w:pStyle w:val="ListParagraph"/>
-        <w:numPr>
-          <w:ilvl w:val="0"/>
-          <w:numId w:val="1"/>
-        </w:numPr>
-        <w:spacing w:after="0" w:line="240" w:lineRule="auto"/>
-        <w:ind w:left="284" w:hanging="284"/>
-        <w:jc w:val="both"/>
-        <w:rPr>
-          <w:rFonts w:cstheme="minorHAnsi"/>
-          <w:sz w:val="24"/>
-          <w:szCs w:val="28"/>
-        </w:rPr>
-      </w:pPr>
-      <w:r>
-        <w:rPr>
-          <w:rFonts w:cstheme="minorHAnsi"/>
-          <w:sz w:val="24"/>
-          <w:szCs w:val="28"/>
-        </w:rPr>
-        <w:t>Menyusun timeline kegiatan, target pencapaian, serta strategi pelaksanaan untuk memastikan seluruh rangkaian acara berjalan sesuai rencana.</w:t>
-      </w:r>
-    </w:p>
-    <w:p>
-      <w:pPr>
-        <w:pStyle w:val="ListParagraph"/>
-        <w:numPr>
-          <w:ilvl w:val="0"/>
-          <w:numId w:val="1"/>
-        </w:numPr>
-        <w:spacing w:after="0" w:line="240" w:lineRule="auto"/>
-        <w:ind w:left="284" w:hanging="284"/>
-        <w:jc w:val="both"/>
-        <w:rPr>
-          <w:rFonts w:cstheme="minorHAnsi"/>
-          <w:sz w:val="24"/>
-          <w:szCs w:val="28"/>
-        </w:rPr>
-      </w:pPr>
-      <w:r>
-        <w:rPr>
-          <w:rFonts w:cstheme="minorHAnsi"/>
-          <w:sz w:val="24"/>
-          <w:szCs w:val="28"/>
-        </w:rPr>
-        <w:t>Merancang rangkaian kegiatan yang mencakup kunjungan sosial ke panti asuhan, sesi seminar/pematerian, dan ceremony Dies Natalis Himpunan IT UKRI.</w:t>
-      </w:r>
-    </w:p>
-    <w:p>
-      <w:pPr>
-        <w:pStyle w:val="ListParagraph"/>
-        <w:numPr>
-          <w:ilvl w:val="0"/>
-          <w:numId w:val="1"/>
-        </w:numPr>
-        <w:spacing w:after="0" w:line="240" w:lineRule="auto"/>
-        <w:ind w:left="284" w:hanging="284"/>
-        <w:jc w:val="both"/>
-        <w:rPr>
-          <w:rFonts w:cstheme="minorHAnsi"/>
-          <w:sz w:val="24"/>
-          <w:szCs w:val="28"/>
-        </w:rPr>
-      </w:pPr>
-      <w:r>
-        <w:rPr>
-          <w:rFonts w:cstheme="minorHAnsi"/>
-          <w:sz w:val="24"/>
-          <w:szCs w:val="28"/>
-        </w:rPr>
-        <w:t>Mengkoordinasikan seluruh divisi pelaksana agar setiap job desk dan target kerja terlaksana secara efektif.</w:t>
-      </w:r>
-    </w:p>
-    <w:p>
-      <w:pPr>
-        <w:pStyle w:val="ListParagraph"/>
-        <w:numPr>
-          <w:ilvl w:val="0"/>
-          <w:numId w:val="1"/>
-        </w:numPr>
-        <w:spacing w:after="0" w:line="240" w:lineRule="auto"/>
-        <w:ind w:left="284" w:hanging="284"/>
-        <w:jc w:val="both"/>
-        <w:rPr>
-          <w:rFonts w:cstheme="minorHAnsi"/>
-          <w:sz w:val="24"/>
-          <w:szCs w:val="28"/>
-        </w:rPr>
-      </w:pPr>
-      <w:r>
-        <w:rPr>
-          <w:rFonts w:cstheme="minorHAnsi"/>
-          <w:sz w:val="24"/>
-          <w:szCs w:val="28"/>
-        </w:rPr>
-        <w:t>Melakukan monitoring dan evaluasi pelaksanaan kegiatan guna memastikan acara berjalan lancar, tepat waktu, dan sesuai tujuan.</w:t>
-      </w:r>
-    </w:p>
-    <w:p>
-      <w:pPr>
-        <w:spacing w:after="0" w:line="240" w:lineRule="auto"/>
-        <w:jc w:val="both"/>
-        <w:rPr>
-          <w:rFonts w:cstheme="minorHAnsi"/>
-          <w:sz w:val="24"/>
-          <w:szCs w:val="28"/>
-        </w:rPr>
-      </w:pPr>
-    </w:p>
-    <w:p>
-      <w:pPr>
-        <w:tabs>
-          <w:tab w:val="left" w:pos="7371"/>
-        </w:tabs>
-        <w:spacing w:after="0" w:line="240" w:lineRule="auto"/>
-        <w:jc w:val="both"/>
-        <w:rPr>
-          <w:rFonts w:cstheme="minorHAnsi"/>
-          <w:b/>
-          <w:sz w:val="24"/>
-          <w:szCs w:val="24"/>
-        </w:rPr>
-      </w:pPr>
-      <w:r>
-        <w:rPr>
-          <w:rFonts w:cstheme="minorHAnsi"/>
-          <w:b/>
-          <w:sz w:val="24"/>
-          <w:szCs w:val="24"/>
-        </w:rPr>
-        <w:t>Speaker – Voyage of Discovery</w:t>
-      </w:r>
-      <w:r>
-        <w:rPr>
-          <w:rFonts w:cstheme="minorHAnsi"/>
-          <w:b/>
-          <w:sz w:val="24"/>
-          <w:szCs w:val="24"/>
-        </w:rPr>
-        <w:t xml:space="preserve"> | </w:t>
-      </w:r>
-      <w:r>
-        <w:rPr>
-          <w:rFonts w:cstheme="minorHAnsi"/>
-          <w:b/>
-          <w:sz w:val="24"/>
-          <w:szCs w:val="24"/>
-        </w:rPr>
-        <w:t>Association of English Literature</w:t>
-      </w:r>
-      <w:r>
-        <w:rPr>
-          <w:rFonts w:cstheme="minorHAnsi"/>
-          <w:b/>
-          <w:sz w:val="24"/>
-          <w:szCs w:val="24"/>
-        </w:rPr>
-        <w:t xml:space="preserve">| </w:t>
-      </w:r>
-      <w:r>
-        <w:rPr>
-          <w:rFonts w:cstheme="minorHAnsi"/>
-          <w:b/>
-          <w:sz w:val="24"/>
-          <w:szCs w:val="24"/>
-        </w:rPr>
-        <w:t xml:space="preserve">November </w:t>
-      </w:r>
-      <w:r>
-        <w:rPr>
-          <w:rFonts w:cstheme="minorHAnsi"/>
-          <w:b/>
-          <w:sz w:val="24"/>
-          <w:szCs w:val="24"/>
-        </w:rPr>
-        <w:t>202</w:t>
-      </w:r>
-      <w:r>
-        <w:rPr>
-          <w:rFonts w:cstheme="minorHAnsi"/>
-          <w:b/>
-          <w:sz w:val="24"/>
-          <w:szCs w:val="24"/>
-        </w:rPr>
-        <w:t>5</w:t>
-      </w:r>
-    </w:p>
-    <w:p>
-      <w:pPr>
-        <w:pStyle w:val="ListParagraph"/>
-        <w:numPr>
-          <w:ilvl w:val="0"/>
-          <w:numId w:val="1"/>
-        </w:numPr>
-        <w:spacing w:after="0" w:line="240" w:lineRule="auto"/>
-        <w:ind w:left="284" w:hanging="284"/>
-        <w:jc w:val="both"/>
-        <w:rPr>
-          <w:rFonts w:cstheme="minorHAnsi"/>
-          <w:sz w:val="24"/>
-          <w:szCs w:val="28"/>
-        </w:rPr>
-      </w:pPr>
-      <w:r>
-        <w:rPr>
-          <w:rFonts w:cstheme="minorHAnsi"/>
-          <w:sz w:val="24"/>
-          <w:szCs w:val="28"/>
-        </w:rPr>
-        <w:t>Menjadi pembicara dalam kegiatan Voyage of Discovery yang dihadiri oleh mahasiswa Sastra Inggris.</w:t>
-      </w:r>
-    </w:p>
-    <w:p>
-      <w:pPr>
-        <w:pStyle w:val="ListParagraph"/>
-        <w:numPr>
-          <w:ilvl w:val="0"/>
-          <w:numId w:val="1"/>
-        </w:numPr>
-        <w:spacing w:after="0" w:line="240" w:lineRule="auto"/>
-        <w:ind w:left="284" w:hanging="284"/>
-        <w:jc w:val="both"/>
-        <w:rPr>
-          <w:rFonts w:cstheme="minorHAnsi"/>
-          <w:sz w:val="24"/>
-          <w:szCs w:val="28"/>
-        </w:rPr>
-      </w:pPr>
-      <w:r>
-        <w:rPr>
-          <w:rFonts w:cstheme="minorHAnsi"/>
-          <w:sz w:val="24"/>
-          <w:szCs w:val="28"/>
-        </w:rPr>
-        <w:t>Menyampaikan materi secara interaktif terkait topik pengembangan wawasan, akademik, dan pengenalan dunia profesional.</w:t>
-      </w:r>
-    </w:p>
-    <w:p>
-      <w:pPr>
-        <w:pStyle w:val="ListParagraph"/>
-        <w:numPr>
-          <w:ilvl w:val="0"/>
-          <w:numId w:val="1"/>
-        </w:numPr>
-        <w:spacing w:after="0" w:line="240" w:lineRule="auto"/>
-        <w:ind w:left="284" w:hanging="284"/>
-        <w:jc w:val="both"/>
-        <w:rPr>
-          <w:rFonts w:cstheme="minorHAnsi"/>
-          <w:sz w:val="24"/>
-          <w:szCs w:val="28"/>
-        </w:rPr>
-      </w:pPr>
-      <w:r>
-        <w:rPr>
-          <w:rFonts w:cstheme="minorHAnsi"/>
-          <w:sz w:val="24"/>
-          <w:szCs w:val="28"/>
-        </w:rPr>
-        <w:t>Membangun komunikasi dua arah dengan peserta melalui sesi diskusi dan tanya jawab untuk meningkatkan pemahaman materi.</w:t>
-      </w:r>
-    </w:p>
-    <w:p>
-      <w:pPr>
-        <w:pStyle w:val="ListParagraph"/>
-        <w:numPr>
-          <w:ilvl w:val="0"/>
-          <w:numId w:val="1"/>
-        </w:numPr>
-        <w:spacing w:after="0" w:line="240" w:lineRule="auto"/>
-        <w:ind w:left="284" w:hanging="284"/>
-        <w:jc w:val="both"/>
-        <w:rPr>
-          <w:rFonts w:cstheme="minorHAnsi"/>
-          <w:sz w:val="24"/>
-          <w:szCs w:val="28"/>
-        </w:rPr>
-      </w:pPr>
-      <w:r>
-        <w:rPr>
-          <w:rFonts w:cstheme="minorHAnsi"/>
-          <w:sz w:val="24"/>
-          <w:szCs w:val="28"/>
-        </w:rPr>
-        <w:t>Menyusun materi presentasi yang informatif, terstruktur, dan relevan dengan kebutuhan audiens.</w:t>
-      </w:r>
-    </w:p>
-    <w:p>
-      <w:pPr>
-        <w:pStyle w:val="ListParagraph"/>
-        <w:numPr>
-          <w:ilvl w:val="0"/>
-          <w:numId w:val="1"/>
-        </w:numPr>
-        <w:spacing w:after="0" w:line="240" w:lineRule="auto"/>
-        <w:ind w:left="284" w:hanging="284"/>
-        <w:jc w:val="both"/>
-        <w:rPr>
-          <w:rFonts w:cstheme="minorHAnsi"/>
-          <w:sz w:val="24"/>
-          <w:szCs w:val="28"/>
-        </w:rPr>
-      </w:pPr>
-      <w:r>
-        <w:rPr>
-          <w:rFonts w:cstheme="minorHAnsi"/>
-          <w:sz w:val="24"/>
-          <w:szCs w:val="28"/>
-        </w:rPr>
-        <w:t>Berkontribusi dalam menciptakan suasana pembelajaran yang aktif, inspiratif, dan kolaboratif.</w:t>
-      </w:r>
-    </w:p>
-    <w:p>
-      <w:pPr>
-        <w:spacing w:after="0" w:line="240" w:lineRule="auto"/>
-        <w:jc w:val="both"/>
-        <w:rPr>
-          <w:rFonts w:cstheme="minorHAnsi"/>
-          <w:sz w:val="24"/>
-          <w:szCs w:val="28"/>
-        </w:rPr>
-      </w:pPr>
-    </w:p>
-    <w:p>
-      <w:pPr>
-        <w:tabs>
-          <w:tab w:val="left" w:pos="7371"/>
-        </w:tabs>
-        <w:spacing w:after="0" w:line="240" w:lineRule="auto"/>
-        <w:jc w:val="both"/>
-        <w:rPr>
-          <w:rFonts w:cstheme="minorHAnsi"/>
-          <w:b/>
-          <w:sz w:val="24"/>
-          <w:szCs w:val="24"/>
-        </w:rPr>
-      </w:pPr>
-      <w:r>
-        <w:rPr>
-          <w:rFonts w:cstheme="minorHAnsi"/>
-          <w:b/>
-          <w:sz w:val="24"/>
-          <w:szCs w:val="24"/>
-        </w:rPr>
-        <w:t>Performer Artist</w:t>
-      </w:r>
-      <w:r>
-        <w:rPr>
-          <w:rFonts w:cstheme="minorHAnsi"/>
-          <w:b/>
-          <w:sz w:val="24"/>
-          <w:szCs w:val="24"/>
-        </w:rPr>
-        <w:t xml:space="preserve"> | </w:t>
-      </w:r>
-      <w:r>
-        <w:rPr>
-          <w:rFonts w:cstheme="minorHAnsi"/>
-          <w:b/>
-          <w:sz w:val="24"/>
-          <w:szCs w:val="24"/>
-        </w:rPr>
-        <w:t>Open House Teater Lima Wajah</w:t>
-      </w:r>
-      <w:r>
-        <w:rPr>
-          <w:rFonts w:cstheme="minorHAnsi"/>
-          <w:b/>
-          <w:sz w:val="24"/>
-          <w:szCs w:val="24"/>
-        </w:rPr>
-        <w:t xml:space="preserve">| </w:t>
-      </w:r>
-      <w:r>
-        <w:rPr>
-          <w:rFonts w:cstheme="minorHAnsi"/>
-          <w:b/>
-          <w:sz w:val="24"/>
-          <w:szCs w:val="24"/>
-        </w:rPr>
-        <w:t xml:space="preserve">Oktober </w:t>
-      </w:r>
-      <w:r>
-        <w:rPr>
-          <w:rFonts w:cstheme="minorHAnsi"/>
-          <w:b/>
-          <w:sz w:val="24"/>
-          <w:szCs w:val="24"/>
-        </w:rPr>
-        <w:t>202</w:t>
-      </w:r>
-      <w:r>
-        <w:rPr>
-          <w:rFonts w:cstheme="minorHAnsi"/>
-          <w:b/>
-          <w:sz w:val="24"/>
-          <w:szCs w:val="24"/>
-        </w:rPr>
-        <w:t>3</w:t>
+        <w:t>Oktober 2023</w:t>
       </w:r>
     </w:p>
     <w:p>

</xml_diff>

<commit_message>
feat(cv): update CV documents (docx and pdf)
</commit_message>
<xml_diff>
--- a/frontend/public/assets/CV_Afif_2026.docx
+++ b/frontend/public/assets/CV_Afif_2026.docx
@@ -161,17 +161,7 @@
           <w:sz w:val="24"/>
           <w:szCs w:val="28"/>
         </w:rPr>
-        <w:t>Mahasiswa S1 Teknik Informatika dengan IPK 3,90/4,00 yang memiliki minat dan pengalaman pada bidang Artificial Intelligence, Data Science, Web Development, serta IT Support. Berpengalaman dalam pengembangan solusi berbasis data dan AI, termasuk implementasi Retrieval-Augmented Generation (RAG), Large Language Model (LLM), Natural Language Processing (NLP), dan customer segmentation menggunakan machine learning. Memiliki pengalaman dalam pemeliharaan infrastruktur sistem, troubleshooting teknis, serta pengembangan aplikasi berbasis web. Selain kompe</w:t>
-      </w:r>
-      <w:bookmarkStart w:id="0" w:name="_GoBack"/>
-      <w:bookmarkEnd w:id="0"/>
-      <w:r>
-        <w:rPr>
-          <w:rFonts w:cstheme="minorHAnsi"/>
-          <w:sz w:val="24"/>
-          <w:szCs w:val="28"/>
-        </w:rPr>
-        <w:t>tensi teknis, memiliki pengalaman kepemimpinan dalam organisasi mahasiswa, manajemen proyek, public speaking, dan kolaborasi tim. Terbiasa bekerja secara analitis, terstruktur, dan berorientasi pada problem solving untuk menghasilkan solusi yang efektif, inovatif, dan berdampak.</w:t>
+        <w:t>Mahasiswa S1 Teknik Informatika dengan IPK 3,90/4,00 yang memiliki minat dan pengalaman pada bidang Artificial Intelligence, Data Science, Web Development, serta IT Support. Berpengalaman dalam pengembangan solusi berbasis data dan AI, termasuk implementasi Retrieval-Augmented Generation (RAG), Large Language Model (LLM), Natural Language Processing (NLP), dan customer segmentation menggunakan machine learning. Memiliki pengalaman dalam pemeliharaan infrastruktur sistem, troubleshooting teknis, serta pengembangan aplikasi berbasis web. Selain kompetensi teknis, memiliki pengalaman kepemimpinan dalam organisasi mahasiswa, manajemen proyek, public speaking, dan kolaborasi tim. Terbiasa bekerja secara analitis, terstruktur, dan berorientasi pada problem solving untuk menghasilkan solusi yang efektif, inovatif, dan berdampak.</w:t>
       </w:r>
     </w:p>
     <w:p>
@@ -770,6 +760,7 @@
     </w:p>
     <w:p>
       <w:pPr>
+        <w:spacing w:after="0"/>
         <w:rPr>
           <w:rFonts w:cstheme="minorHAnsi"/>
           <w:b/>
@@ -904,10 +895,13 @@
         <w:ind w:left="284" w:hanging="284"/>
         <w:jc w:val="both"/>
         <w:rPr>
-          <w:rFonts w:cstheme="minorHAnsi"/>
-          <w:b/>
-          <w:sz w:val="24"/>
-          <w:szCs w:val="24"/>
+          <w:rStyle w:val="Hyperlink"/>
+          <w:rFonts w:cstheme="minorHAnsi"/>
+          <w:b/>
+          <w:color w:val="auto"/>
+          <w:sz w:val="24"/>
+          <w:szCs w:val="24"/>
+          <w:u w:val="none"/>
         </w:rPr>
       </w:pPr>
       <w:r>
@@ -932,10 +926,625 @@
     </w:p>
     <w:p>
       <w:pPr>
+        <w:pStyle w:val="ListParagraph"/>
         <w:tabs>
           <w:tab w:val="left" w:pos="7371"/>
         </w:tabs>
         <w:spacing w:before="240" w:after="0" w:line="240" w:lineRule="auto"/>
+        <w:ind w:left="284"/>
+        <w:jc w:val="both"/>
+        <w:rPr>
+          <w:rStyle w:val="Hyperlink"/>
+          <w:rFonts w:cstheme="minorHAnsi"/>
+          <w:b/>
+          <w:color w:val="auto"/>
+          <w:sz w:val="24"/>
+          <w:szCs w:val="24"/>
+          <w:u w:val="none"/>
+        </w:rPr>
+      </w:pPr>
+    </w:p>
+    <w:p>
+      <w:pPr>
+        <w:spacing w:after="0" w:line="240" w:lineRule="auto"/>
+        <w:rPr>
+          <w:rFonts w:cstheme="minorHAnsi"/>
+          <w:b/>
+          <w:sz w:val="24"/>
+          <w:szCs w:val="24"/>
+        </w:rPr>
+      </w:pPr>
+      <w:r>
+        <w:rPr>
+          <w:rFonts w:cstheme="minorHAnsi"/>
+          <w:b/>
+          <w:sz w:val="24"/>
+          <w:szCs w:val="24"/>
+        </w:rPr>
+        <w:t>DiagnoMed RuleBasedMedic | Expert System, AI Logic &amp; Full Stack Development | 2026</w:t>
+      </w:r>
+    </w:p>
+    <w:p>
+      <w:pPr>
+        <w:pStyle w:val="ListParagraph"/>
+        <w:numPr>
+          <w:ilvl w:val="0"/>
+          <w:numId w:val="1"/>
+        </w:numPr>
+        <w:spacing w:after="0" w:line="240" w:lineRule="auto"/>
+        <w:ind w:left="284" w:hanging="284"/>
+        <w:jc w:val="both"/>
+        <w:rPr>
+          <w:rFonts w:cstheme="minorHAnsi"/>
+          <w:sz w:val="24"/>
+          <w:szCs w:val="24"/>
+        </w:rPr>
+      </w:pPr>
+      <w:r>
+        <w:rPr>
+          <w:rFonts w:ascii="Times New Roman" w:eastAsia="Times New Roman" w:hAnsi="Times New Roman" w:cs="Times New Roman"/>
+          <w:sz w:val="24"/>
+          <w:szCs w:val="24"/>
+          <w:lang w:eastAsia="en-ID"/>
+        </w:rPr>
+        <w:t xml:space="preserve">Merancang dan mengembangkan sistem pakar berbasis web untuk mendukung </w:t>
+      </w:r>
+      <w:r>
+        <w:rPr>
+          <w:rFonts w:cstheme="minorHAnsi"/>
+          <w:sz w:val="24"/>
+          <w:szCs w:val="24"/>
+        </w:rPr>
+        <w:t xml:space="preserve">swamedikasi awal melalui analisis gejala, diagnosis penyakit ringan, dan rekomendasi obat berbasis pengetahuan apoteker. </w:t>
+      </w:r>
+    </w:p>
+    <w:p>
+      <w:pPr>
+        <w:pStyle w:val="ListParagraph"/>
+        <w:numPr>
+          <w:ilvl w:val="0"/>
+          <w:numId w:val="1"/>
+        </w:numPr>
+        <w:spacing w:after="0" w:line="240" w:lineRule="auto"/>
+        <w:ind w:left="284" w:hanging="284"/>
+        <w:jc w:val="both"/>
+        <w:rPr>
+          <w:rFonts w:cstheme="minorHAnsi"/>
+          <w:sz w:val="24"/>
+          <w:szCs w:val="24"/>
+        </w:rPr>
+      </w:pPr>
+      <w:r>
+        <w:rPr>
+          <w:rFonts w:cstheme="minorHAnsi"/>
+          <w:sz w:val="24"/>
+          <w:szCs w:val="24"/>
+        </w:rPr>
+        <w:t xml:space="preserve">Mengintegrasikan metode inferensi Rule-Based Reasoning, Forward Chaining, Backward Chaining, serta Certainty Factor untuk menghasilkan diagnosis yang lebih akurat dan terukur. </w:t>
+      </w:r>
+    </w:p>
+    <w:p>
+      <w:pPr>
+        <w:pStyle w:val="ListParagraph"/>
+        <w:numPr>
+          <w:ilvl w:val="0"/>
+          <w:numId w:val="1"/>
+        </w:numPr>
+        <w:spacing w:after="0" w:line="240" w:lineRule="auto"/>
+        <w:ind w:left="284" w:hanging="284"/>
+        <w:jc w:val="both"/>
+        <w:rPr>
+          <w:rFonts w:cstheme="minorHAnsi"/>
+          <w:sz w:val="24"/>
+          <w:szCs w:val="24"/>
+        </w:rPr>
+      </w:pPr>
+      <w:r>
+        <w:rPr>
+          <w:rFonts w:cstheme="minorHAnsi"/>
+          <w:sz w:val="24"/>
+          <w:szCs w:val="24"/>
+        </w:rPr>
+        <w:t xml:space="preserve">Mengembangkan arsitektur full stack menggunakan Laravel, MySQL, Tailwind CSS, dan Vite dengan implementasi role-based access control untuk pengguna Masyarakat dan Admin Apoteker. </w:t>
+      </w:r>
+    </w:p>
+    <w:p>
+      <w:pPr>
+        <w:pStyle w:val="ListParagraph"/>
+        <w:numPr>
+          <w:ilvl w:val="0"/>
+          <w:numId w:val="1"/>
+        </w:numPr>
+        <w:spacing w:after="0" w:line="240" w:lineRule="auto"/>
+        <w:ind w:left="284" w:hanging="284"/>
+        <w:jc w:val="both"/>
+        <w:rPr>
+          <w:rFonts w:cstheme="minorHAnsi"/>
+          <w:sz w:val="24"/>
+          <w:szCs w:val="24"/>
+        </w:rPr>
+      </w:pPr>
+      <w:r>
+        <w:rPr>
+          <w:rFonts w:cstheme="minorHAnsi"/>
+          <w:sz w:val="24"/>
+          <w:szCs w:val="24"/>
+        </w:rPr>
+        <w:t xml:space="preserve">Link Proyek: </w:t>
+      </w:r>
+      <w:hyperlink r:id="rId11" w:history="1">
+        <w:r>
+          <w:rPr>
+            <w:rStyle w:val="Hyperlink"/>
+            <w:rFonts w:cstheme="minorHAnsi"/>
+            <w:sz w:val="24"/>
+            <w:szCs w:val="24"/>
+          </w:rPr>
+          <w:t>https://github.com/AlAfif19/rulebasedmedic</w:t>
+        </w:r>
+      </w:hyperlink>
+    </w:p>
+    <w:p>
+      <w:pPr>
+        <w:pStyle w:val="ListParagraph"/>
+        <w:spacing w:after="0" w:line="240" w:lineRule="auto"/>
+        <w:ind w:left="284"/>
+        <w:jc w:val="both"/>
+        <w:rPr>
+          <w:rFonts w:cstheme="minorHAnsi"/>
+          <w:sz w:val="24"/>
+          <w:szCs w:val="24"/>
+        </w:rPr>
+      </w:pPr>
+    </w:p>
+    <w:p>
+      <w:pPr>
+        <w:spacing w:after="0" w:line="240" w:lineRule="auto"/>
+        <w:rPr>
+          <w:rFonts w:cstheme="minorHAnsi"/>
+          <w:b/>
+          <w:sz w:val="24"/>
+          <w:szCs w:val="24"/>
+        </w:rPr>
+      </w:pPr>
+      <w:r>
+        <w:rPr>
+          <w:rFonts w:cstheme="minorHAnsi"/>
+          <w:b/>
+          <w:sz w:val="24"/>
+          <w:szCs w:val="24"/>
+        </w:rPr>
+        <w:t>Warung HPP | Full Stack Web Application &amp; Business Intelligence | 2026</w:t>
+      </w:r>
+    </w:p>
+    <w:p>
+      <w:pPr>
+        <w:pStyle w:val="ListParagraph"/>
+        <w:numPr>
+          <w:ilvl w:val="0"/>
+          <w:numId w:val="1"/>
+        </w:numPr>
+        <w:spacing w:after="0" w:line="240" w:lineRule="auto"/>
+        <w:ind w:left="284" w:hanging="284"/>
+        <w:jc w:val="both"/>
+        <w:rPr>
+          <w:rFonts w:cstheme="minorHAnsi"/>
+          <w:sz w:val="24"/>
+          <w:szCs w:val="28"/>
+        </w:rPr>
+      </w:pPr>
+      <w:r>
+        <w:rPr>
+          <w:rFonts w:cstheme="minorHAnsi"/>
+          <w:sz w:val="24"/>
+          <w:szCs w:val="28"/>
+        </w:rPr>
+        <w:t xml:space="preserve">Merancang dan mengembangkan platform digital berbasis web untuk mendukung digitalisasi operasional warung dan UMKM melalui manajemen menu, pricing, dan analisis profitabilitas. </w:t>
+      </w:r>
+    </w:p>
+    <w:p>
+      <w:pPr>
+        <w:pStyle w:val="ListParagraph"/>
+        <w:numPr>
+          <w:ilvl w:val="0"/>
+          <w:numId w:val="1"/>
+        </w:numPr>
+        <w:spacing w:after="0" w:line="240" w:lineRule="auto"/>
+        <w:ind w:left="284" w:hanging="284"/>
+        <w:jc w:val="both"/>
+        <w:rPr>
+          <w:rFonts w:cstheme="minorHAnsi"/>
+          <w:sz w:val="24"/>
+          <w:szCs w:val="28"/>
+        </w:rPr>
+      </w:pPr>
+      <w:r>
+        <w:rPr>
+          <w:rFonts w:cstheme="minorHAnsi"/>
+          <w:sz w:val="24"/>
+          <w:szCs w:val="28"/>
+        </w:rPr>
+        <w:t xml:space="preserve">Mengembangkan modul kalkulator HPP berbasis data yang mampu menghitung biaya produksi, strategi harga jual, margin keuntungan, hingga proyeksi pertumbuhan bisnis. </w:t>
+      </w:r>
+    </w:p>
+    <w:p>
+      <w:pPr>
+        <w:pStyle w:val="ListParagraph"/>
+        <w:numPr>
+          <w:ilvl w:val="0"/>
+          <w:numId w:val="1"/>
+        </w:numPr>
+        <w:spacing w:after="0" w:line="240" w:lineRule="auto"/>
+        <w:ind w:left="284" w:hanging="284"/>
+        <w:jc w:val="both"/>
+        <w:rPr>
+          <w:rFonts w:cstheme="minorHAnsi"/>
+          <w:sz w:val="24"/>
+          <w:szCs w:val="24"/>
+        </w:rPr>
+      </w:pPr>
+      <w:r>
+        <w:rPr>
+          <w:rFonts w:cstheme="minorHAnsi"/>
+          <w:sz w:val="24"/>
+          <w:szCs w:val="28"/>
+        </w:rPr>
+        <w:t xml:space="preserve">Membangun frontend interaktif menggunakan Next.js dan backend API menggunakan FastAPI yang terintegrasi dengan MySQL untuk memastikan performa, skalabilitas, dan </w:t>
+      </w:r>
+      <w:r>
+        <w:rPr>
+          <w:rFonts w:cstheme="minorHAnsi"/>
+          <w:sz w:val="24"/>
+          <w:szCs w:val="24"/>
+        </w:rPr>
+        <w:t xml:space="preserve">efisiensi pengolahan data. </w:t>
+      </w:r>
+    </w:p>
+    <w:p>
+      <w:pPr>
+        <w:pStyle w:val="ListParagraph"/>
+        <w:numPr>
+          <w:ilvl w:val="0"/>
+          <w:numId w:val="1"/>
+        </w:numPr>
+        <w:spacing w:after="0" w:line="240" w:lineRule="auto"/>
+        <w:ind w:left="284" w:hanging="284"/>
+        <w:jc w:val="both"/>
+        <w:rPr>
+          <w:rFonts w:cstheme="minorHAnsi"/>
+          <w:sz w:val="24"/>
+          <w:szCs w:val="24"/>
+        </w:rPr>
+      </w:pPr>
+      <w:r>
+        <w:rPr>
+          <w:rFonts w:cstheme="minorHAnsi"/>
+          <w:sz w:val="24"/>
+          <w:szCs w:val="24"/>
+        </w:rPr>
+        <w:t xml:space="preserve">Link Proyek: </w:t>
+      </w:r>
+      <w:hyperlink r:id="rId12" w:history="1">
+        <w:r>
+          <w:rPr>
+            <w:rStyle w:val="Hyperlink"/>
+            <w:rFonts w:cstheme="minorHAnsi"/>
+            <w:sz w:val="24"/>
+            <w:szCs w:val="24"/>
+          </w:rPr>
+          <w:t>https://github.com/AlAfif19/warung</w:t>
+        </w:r>
+      </w:hyperlink>
+    </w:p>
+    <w:p>
+      <w:pPr>
+        <w:spacing w:after="0" w:line="240" w:lineRule="auto"/>
+        <w:jc w:val="both"/>
+        <w:rPr>
+          <w:rFonts w:cstheme="minorHAnsi"/>
+          <w:sz w:val="24"/>
+          <w:szCs w:val="28"/>
+        </w:rPr>
+      </w:pPr>
+    </w:p>
+    <w:p>
+      <w:pPr>
+        <w:spacing w:after="0" w:line="240" w:lineRule="auto"/>
+        <w:rPr>
+          <w:rFonts w:cstheme="minorHAnsi"/>
+          <w:b/>
+          <w:sz w:val="24"/>
+          <w:szCs w:val="24"/>
+        </w:rPr>
+      </w:pPr>
+      <w:r>
+        <w:rPr>
+          <w:rFonts w:cstheme="minorHAnsi"/>
+          <w:b/>
+          <w:sz w:val="24"/>
+          <w:szCs w:val="24"/>
+        </w:rPr>
+        <w:t>JourneyHil Magical | Frontend Development &amp; Interactive Game | 2026</w:t>
+      </w:r>
+    </w:p>
+    <w:p>
+      <w:pPr>
+        <w:pStyle w:val="ListParagraph"/>
+        <w:numPr>
+          <w:ilvl w:val="0"/>
+          <w:numId w:val="1"/>
+        </w:numPr>
+        <w:spacing w:after="0" w:line="240" w:lineRule="auto"/>
+        <w:ind w:left="284" w:hanging="284"/>
+        <w:jc w:val="both"/>
+        <w:rPr>
+          <w:rFonts w:cstheme="minorHAnsi"/>
+          <w:sz w:val="24"/>
+          <w:szCs w:val="28"/>
+        </w:rPr>
+      </w:pPr>
+      <w:r>
+        <w:rPr>
+          <w:rFonts w:cstheme="minorHAnsi"/>
+          <w:sz w:val="24"/>
+          <w:szCs w:val="28"/>
+        </w:rPr>
+        <w:t xml:space="preserve">Merancang dan mengembangkan website interaktif bertema Magical Kuromi yang mengintegrasikan profil, story, timeline, galeri, pemutar musik, dan dokumentasi perjalanan dalam satu aplikasi web. </w:t>
+      </w:r>
+    </w:p>
+    <w:p>
+      <w:pPr>
+        <w:pStyle w:val="ListParagraph"/>
+        <w:numPr>
+          <w:ilvl w:val="0"/>
+          <w:numId w:val="1"/>
+        </w:numPr>
+        <w:spacing w:after="0" w:line="240" w:lineRule="auto"/>
+        <w:ind w:left="284" w:hanging="284"/>
+        <w:jc w:val="both"/>
+        <w:rPr>
+          <w:rFonts w:cstheme="minorHAnsi"/>
+          <w:sz w:val="24"/>
+          <w:szCs w:val="28"/>
+        </w:rPr>
+      </w:pPr>
+      <w:r>
+        <w:rPr>
+          <w:rFonts w:cstheme="minorHAnsi"/>
+          <w:sz w:val="24"/>
+          <w:szCs w:val="28"/>
+        </w:rPr>
+        <w:t xml:space="preserve">Mengembangkan mini game Kuromi Care dengan sistem virtual pet berbasis state management, logika perubahan status otomatis, animasi karakter, serta fitur share dan penyimpanan progres melalui Local Storage. </w:t>
+      </w:r>
+    </w:p>
+    <w:p>
+      <w:pPr>
+        <w:pStyle w:val="ListParagraph"/>
+        <w:numPr>
+          <w:ilvl w:val="0"/>
+          <w:numId w:val="1"/>
+        </w:numPr>
+        <w:spacing w:after="0" w:line="240" w:lineRule="auto"/>
+        <w:ind w:left="284" w:hanging="284"/>
+        <w:jc w:val="both"/>
+        <w:rPr>
+          <w:rFonts w:cstheme="minorHAnsi"/>
+          <w:sz w:val="24"/>
+          <w:szCs w:val="28"/>
+        </w:rPr>
+      </w:pPr>
+      <w:r>
+        <w:rPr>
+          <w:rFonts w:cstheme="minorHAnsi"/>
+          <w:sz w:val="24"/>
+          <w:szCs w:val="28"/>
+        </w:rPr>
+        <w:t xml:space="preserve">Membangun antarmuka modern menggunakan React, TypeScript, Vite, Tailwind CSS, dan Framer Motion dengan fokus pada performa, responsivitas, dan pengalaman pengguna. </w:t>
+      </w:r>
+    </w:p>
+    <w:p>
+      <w:pPr>
+        <w:pStyle w:val="ListParagraph"/>
+        <w:numPr>
+          <w:ilvl w:val="0"/>
+          <w:numId w:val="1"/>
+        </w:numPr>
+        <w:spacing w:after="0" w:line="240" w:lineRule="auto"/>
+        <w:ind w:left="284" w:hanging="284"/>
+        <w:jc w:val="both"/>
+        <w:rPr>
+          <w:rFonts w:cstheme="minorHAnsi"/>
+          <w:sz w:val="24"/>
+          <w:szCs w:val="28"/>
+        </w:rPr>
+      </w:pPr>
+      <w:r>
+        <w:rPr>
+          <w:rFonts w:cstheme="minorHAnsi"/>
+          <w:sz w:val="24"/>
+          <w:szCs w:val="28"/>
+        </w:rPr>
+        <w:t xml:space="preserve">Link Proyek: </w:t>
+      </w:r>
+      <w:hyperlink r:id="rId13" w:history="1">
+        <w:r>
+          <w:rPr>
+            <w:rStyle w:val="Hyperlink"/>
+            <w:rFonts w:cstheme="minorHAnsi"/>
+            <w:sz w:val="24"/>
+            <w:szCs w:val="28"/>
+          </w:rPr>
+          <w:t>https://github.com/AlAfif19/journeyhil</w:t>
+        </w:r>
+      </w:hyperlink>
+    </w:p>
+    <w:p>
+      <w:pPr>
+        <w:rPr>
+          <w:rFonts w:cstheme="minorHAnsi"/>
+          <w:sz w:val="24"/>
+          <w:szCs w:val="28"/>
+        </w:rPr>
+      </w:pPr>
+      <w:r>
+        <w:rPr>
+          <w:rFonts w:cstheme="minorHAnsi"/>
+          <w:sz w:val="24"/>
+          <w:szCs w:val="28"/>
+        </w:rPr>
+        <w:br w:type="page"/>
+      </w:r>
+    </w:p>
+    <w:p>
+      <w:pPr>
+        <w:pStyle w:val="ListParagraph"/>
+        <w:spacing w:after="0" w:line="240" w:lineRule="auto"/>
+        <w:ind w:left="284"/>
+        <w:jc w:val="both"/>
+        <w:rPr>
+          <w:rFonts w:cstheme="minorHAnsi"/>
+          <w:sz w:val="24"/>
+          <w:szCs w:val="28"/>
+        </w:rPr>
+      </w:pPr>
+    </w:p>
+    <w:p>
+      <w:pPr>
+        <w:spacing w:after="0" w:line="240" w:lineRule="auto"/>
+        <w:rPr>
+          <w:rFonts w:ascii="Times New Roman" w:eastAsia="Times New Roman" w:hAnsi="Times New Roman" w:cs="Times New Roman"/>
+          <w:sz w:val="24"/>
+          <w:szCs w:val="24"/>
+          <w:lang w:eastAsia="en-ID"/>
+        </w:rPr>
+      </w:pPr>
+      <w:r>
+        <w:rPr>
+          <w:rFonts w:cstheme="minorHAnsi"/>
+          <w:b/>
+          <w:sz w:val="24"/>
+          <w:szCs w:val="24"/>
+        </w:rPr>
+        <w:t>Aliya Wedding Organizer | Frontend Development, UI/UX &amp; Landing Page Optimization | 2026</w:t>
+      </w:r>
+    </w:p>
+    <w:p>
+      <w:pPr>
+        <w:pStyle w:val="ListParagraph"/>
+        <w:numPr>
+          <w:ilvl w:val="0"/>
+          <w:numId w:val="1"/>
+        </w:numPr>
+        <w:spacing w:after="0" w:line="240" w:lineRule="auto"/>
+        <w:ind w:left="284" w:hanging="284"/>
+        <w:jc w:val="both"/>
+        <w:rPr>
+          <w:rFonts w:cstheme="minorHAnsi"/>
+          <w:sz w:val="24"/>
+          <w:szCs w:val="28"/>
+        </w:rPr>
+      </w:pPr>
+      <w:r>
+        <w:rPr>
+          <w:rFonts w:cstheme="minorHAnsi"/>
+          <w:sz w:val="24"/>
+          <w:szCs w:val="28"/>
+        </w:rPr>
+        <w:t xml:space="preserve">Merancang dan mengembangkan website landing page premium untuk wedding organizer dengan fokus pada visual branding, user experience, dan conversion-oriented design. </w:t>
+      </w:r>
+    </w:p>
+    <w:p>
+      <w:pPr>
+        <w:pStyle w:val="ListParagraph"/>
+        <w:numPr>
+          <w:ilvl w:val="0"/>
+          <w:numId w:val="1"/>
+        </w:numPr>
+        <w:spacing w:after="0" w:line="240" w:lineRule="auto"/>
+        <w:ind w:left="284" w:hanging="284"/>
+        <w:jc w:val="both"/>
+        <w:rPr>
+          <w:rFonts w:cstheme="minorHAnsi"/>
+          <w:sz w:val="24"/>
+          <w:szCs w:val="28"/>
+        </w:rPr>
+      </w:pPr>
+      <w:r>
+        <w:rPr>
+          <w:rFonts w:cstheme="minorHAnsi"/>
+          <w:sz w:val="24"/>
+          <w:szCs w:val="28"/>
+        </w:rPr>
+        <w:t xml:space="preserve">Mengimplementasikan fitur interaktif seperti responsive design, parallax scrolling, animated sections, gallery modal, testimonial slider, dan FAQ accordion untuk meningkatkan user engagement. </w:t>
+      </w:r>
+    </w:p>
+    <w:p>
+      <w:pPr>
+        <w:pStyle w:val="ListParagraph"/>
+        <w:numPr>
+          <w:ilvl w:val="0"/>
+          <w:numId w:val="1"/>
+        </w:numPr>
+        <w:spacing w:after="0" w:line="240" w:lineRule="auto"/>
+        <w:ind w:left="284" w:hanging="284"/>
+        <w:jc w:val="both"/>
+        <w:rPr>
+          <w:rFonts w:cstheme="minorHAnsi"/>
+          <w:sz w:val="24"/>
+          <w:szCs w:val="28"/>
+        </w:rPr>
+      </w:pPr>
+      <w:r>
+        <w:rPr>
+          <w:rFonts w:cstheme="minorHAnsi"/>
+          <w:sz w:val="24"/>
+          <w:szCs w:val="28"/>
+        </w:rPr>
+        <w:t xml:space="preserve">Mengoptimalkan performa website melalui asset compression, static deployment architecture, dan struktur konten modular agar mudah dikembangkan serta dikelola. </w:t>
+      </w:r>
+    </w:p>
+    <w:p>
+      <w:pPr>
+        <w:pStyle w:val="ListParagraph"/>
+        <w:numPr>
+          <w:ilvl w:val="0"/>
+          <w:numId w:val="1"/>
+        </w:numPr>
+        <w:spacing w:after="0" w:line="240" w:lineRule="auto"/>
+        <w:ind w:left="284" w:hanging="284"/>
+        <w:jc w:val="both"/>
+        <w:rPr>
+          <w:rFonts w:cstheme="minorHAnsi"/>
+          <w:sz w:val="24"/>
+          <w:szCs w:val="28"/>
+        </w:rPr>
+      </w:pPr>
+      <w:r>
+        <w:rPr>
+          <w:rFonts w:cstheme="minorHAnsi"/>
+          <w:sz w:val="24"/>
+          <w:szCs w:val="28"/>
+        </w:rPr>
+        <w:t xml:space="preserve">Link Proyek: </w:t>
+      </w:r>
+      <w:hyperlink r:id="rId14" w:history="1">
+        <w:r>
+          <w:rPr>
+            <w:rStyle w:val="Hyperlink"/>
+            <w:rFonts w:cstheme="minorHAnsi"/>
+            <w:sz w:val="24"/>
+            <w:szCs w:val="28"/>
+          </w:rPr>
+          <w:t>https://github.com/AlAfif19/wedding</w:t>
+        </w:r>
+      </w:hyperlink>
+    </w:p>
+    <w:p>
+      <w:pPr>
+        <w:tabs>
+          <w:tab w:val="left" w:pos="7371"/>
+        </w:tabs>
+        <w:spacing w:before="240" w:after="0" w:line="240" w:lineRule="auto"/>
         <w:jc w:val="both"/>
         <w:rPr>
           <w:rFonts w:cstheme="minorHAnsi"/>
@@ -953,6 +1562,8 @@
         </w:rPr>
         <w:t>Project Software Quality Assurance | QA Tester | 2025</w:t>
       </w:r>
+      <w:bookmarkStart w:id="0" w:name="_GoBack"/>
+      <w:bookmarkEnd w:id="0"/>
     </w:p>
     <w:p>
       <w:pPr>
@@ -2570,6 +3181,304 @@
 <file path=word/numbering.xml><?xml version="1.0" encoding="utf-8"?>
 <w:numbering xmlns:wpc="http://schemas.microsoft.com/office/word/2010/wordprocessingCanvas" xmlns:cx="http://schemas.microsoft.com/office/drawing/2014/chartex" xmlns:cx1="http://schemas.microsoft.com/office/drawing/2015/9/8/chartex" xmlns:cx2="http://schemas.microsoft.com/office/drawing/2015/10/21/chartex" xmlns:cx3="http://schemas.microsoft.com/office/drawing/2016/5/9/chartex" xmlns:cx4="http://schemas.microsoft.com/office/drawing/2016/5/10/chartex" xmlns:cx5="http://schemas.microsoft.com/office/drawing/2016/5/11/chartex" xmlns:cx6="http://schemas.microsoft.com/office/drawing/2016/5/12/chartex" xmlns:cx7="http://schemas.microsoft.com/office/drawing/2016/5/13/chartex" xmlns:cx8="http://schemas.microsoft.com/office/drawing/2016/5/14/chartex" xmlns:mc="http://schemas.openxmlformats.org/markup-compatibility/2006" xmlns:aink="http://schemas.microsoft.com/office/drawing/2016/ink" xmlns:am3d="http://schemas.microsoft.com/office/drawing/2017/model3d" xmlns:o="urn:schemas-microsoft-com:office:office" xmlns:r="http://schemas.openxmlformats.org/officeDocument/2006/relationships" xmlns:m="http://schemas.openxmlformats.org/officeDocument/2006/math" xmlns:v="urn:schemas-microsoft-com:vml" xmlns:wp14="http://schemas.microsoft.com/office/word/2010/wordprocessingDrawing" xmlns:wp="http://schemas.openxmlformats.org/drawingml/2006/wordprocessingDrawing" xmlns:w10="urn:schemas-microsoft-com:office:word" xmlns:w="http://schemas.openxmlformats.org/wordprocessingml/2006/main" xmlns:w14="http://schemas.microsoft.com/office/word/2010/wordml" xmlns:w15="http://schemas.microsoft.com/office/word/2012/wordml" xmlns:w16cid="http://schemas.microsoft.com/office/word/2016/wordml/cid" xmlns:w16se="http://schemas.microsoft.com/office/word/2015/wordml/symex" xmlns:wpg="http://schemas.microsoft.com/office/word/2010/wordprocessingGroup" xmlns:wpi="http://schemas.microsoft.com/office/word/2010/wordprocessingInk" xmlns:wne="http://schemas.microsoft.com/office/word/2006/wordml" xmlns:wps="http://schemas.microsoft.com/office/word/2010/wordprocessingShape" mc:Ignorable="w14 w15 w16se w16cid wp14">
   <w:abstractNum w:abstractNumId="0" w15:restartNumberingAfterBreak="0">
+    <w:nsid w:val="2812768F"/>
+    <w:multiLevelType w:val="multilevel"/>
+    <w:tmpl w:val="469431C0"/>
+    <w:lvl w:ilvl="0">
+      <w:start w:val="1"/>
+      <w:numFmt w:val="bullet"/>
+      <w:lvlText w:val=""/>
+      <w:lvlJc w:val="left"/>
+      <w:pPr>
+        <w:tabs>
+          <w:tab w:val="num" w:pos="720"/>
+        </w:tabs>
+        <w:ind w:left="720" w:hanging="360"/>
+      </w:pPr>
+      <w:rPr>
+        <w:rFonts w:ascii="Symbol" w:hAnsi="Symbol" w:hint="default"/>
+        <w:sz w:val="20"/>
+      </w:rPr>
+    </w:lvl>
+    <w:lvl w:ilvl="1" w:tentative="1">
+      <w:start w:val="1"/>
+      <w:numFmt w:val="bullet"/>
+      <w:lvlText w:val="o"/>
+      <w:lvlJc w:val="left"/>
+      <w:pPr>
+        <w:tabs>
+          <w:tab w:val="num" w:pos="1440"/>
+        </w:tabs>
+        <w:ind w:left="1440" w:hanging="360"/>
+      </w:pPr>
+      <w:rPr>
+        <w:rFonts w:ascii="Courier New" w:hAnsi="Courier New" w:hint="default"/>
+        <w:sz w:val="20"/>
+      </w:rPr>
+    </w:lvl>
+    <w:lvl w:ilvl="2" w:tentative="1">
+      <w:start w:val="1"/>
+      <w:numFmt w:val="bullet"/>
+      <w:lvlText w:val=""/>
+      <w:lvlJc w:val="left"/>
+      <w:pPr>
+        <w:tabs>
+          <w:tab w:val="num" w:pos="2160"/>
+        </w:tabs>
+        <w:ind w:left="2160" w:hanging="360"/>
+      </w:pPr>
+      <w:rPr>
+        <w:rFonts w:ascii="Wingdings" w:hAnsi="Wingdings" w:hint="default"/>
+        <w:sz w:val="20"/>
+      </w:rPr>
+    </w:lvl>
+    <w:lvl w:ilvl="3" w:tentative="1">
+      <w:start w:val="1"/>
+      <w:numFmt w:val="bullet"/>
+      <w:lvlText w:val=""/>
+      <w:lvlJc w:val="left"/>
+      <w:pPr>
+        <w:tabs>
+          <w:tab w:val="num" w:pos="2880"/>
+        </w:tabs>
+        <w:ind w:left="2880" w:hanging="360"/>
+      </w:pPr>
+      <w:rPr>
+        <w:rFonts w:ascii="Wingdings" w:hAnsi="Wingdings" w:hint="default"/>
+        <w:sz w:val="20"/>
+      </w:rPr>
+    </w:lvl>
+    <w:lvl w:ilvl="4" w:tentative="1">
+      <w:start w:val="1"/>
+      <w:numFmt w:val="bullet"/>
+      <w:lvlText w:val=""/>
+      <w:lvlJc w:val="left"/>
+      <w:pPr>
+        <w:tabs>
+          <w:tab w:val="num" w:pos="3600"/>
+        </w:tabs>
+        <w:ind w:left="3600" w:hanging="360"/>
+      </w:pPr>
+      <w:rPr>
+        <w:rFonts w:ascii="Wingdings" w:hAnsi="Wingdings" w:hint="default"/>
+        <w:sz w:val="20"/>
+      </w:rPr>
+    </w:lvl>
+    <w:lvl w:ilvl="5" w:tentative="1">
+      <w:start w:val="1"/>
+      <w:numFmt w:val="bullet"/>
+      <w:lvlText w:val=""/>
+      <w:lvlJc w:val="left"/>
+      <w:pPr>
+        <w:tabs>
+          <w:tab w:val="num" w:pos="4320"/>
+        </w:tabs>
+        <w:ind w:left="4320" w:hanging="360"/>
+      </w:pPr>
+      <w:rPr>
+        <w:rFonts w:ascii="Wingdings" w:hAnsi="Wingdings" w:hint="default"/>
+        <w:sz w:val="20"/>
+      </w:rPr>
+    </w:lvl>
+    <w:lvl w:ilvl="6" w:tentative="1">
+      <w:start w:val="1"/>
+      <w:numFmt w:val="bullet"/>
+      <w:lvlText w:val=""/>
+      <w:lvlJc w:val="left"/>
+      <w:pPr>
+        <w:tabs>
+          <w:tab w:val="num" w:pos="5040"/>
+        </w:tabs>
+        <w:ind w:left="5040" w:hanging="360"/>
+      </w:pPr>
+      <w:rPr>
+        <w:rFonts w:ascii="Wingdings" w:hAnsi="Wingdings" w:hint="default"/>
+        <w:sz w:val="20"/>
+      </w:rPr>
+    </w:lvl>
+    <w:lvl w:ilvl="7" w:tentative="1">
+      <w:start w:val="1"/>
+      <w:numFmt w:val="bullet"/>
+      <w:lvlText w:val=""/>
+      <w:lvlJc w:val="left"/>
+      <w:pPr>
+        <w:tabs>
+          <w:tab w:val="num" w:pos="5760"/>
+        </w:tabs>
+        <w:ind w:left="5760" w:hanging="360"/>
+      </w:pPr>
+      <w:rPr>
+        <w:rFonts w:ascii="Wingdings" w:hAnsi="Wingdings" w:hint="default"/>
+        <w:sz w:val="20"/>
+      </w:rPr>
+    </w:lvl>
+    <w:lvl w:ilvl="8" w:tentative="1">
+      <w:start w:val="1"/>
+      <w:numFmt w:val="bullet"/>
+      <w:lvlText w:val=""/>
+      <w:lvlJc w:val="left"/>
+      <w:pPr>
+        <w:tabs>
+          <w:tab w:val="num" w:pos="6480"/>
+        </w:tabs>
+        <w:ind w:left="6480" w:hanging="360"/>
+      </w:pPr>
+      <w:rPr>
+        <w:rFonts w:ascii="Wingdings" w:hAnsi="Wingdings" w:hint="default"/>
+        <w:sz w:val="20"/>
+      </w:rPr>
+    </w:lvl>
+  </w:abstractNum>
+  <w:abstractNum w:abstractNumId="1" w15:restartNumberingAfterBreak="0">
+    <w:nsid w:val="2EF656D3"/>
+    <w:multiLevelType w:val="multilevel"/>
+    <w:tmpl w:val="4B44D3E4"/>
+    <w:lvl w:ilvl="0">
+      <w:start w:val="1"/>
+      <w:numFmt w:val="bullet"/>
+      <w:lvlText w:val=""/>
+      <w:lvlJc w:val="left"/>
+      <w:pPr>
+        <w:tabs>
+          <w:tab w:val="num" w:pos="720"/>
+        </w:tabs>
+        <w:ind w:left="720" w:hanging="360"/>
+      </w:pPr>
+      <w:rPr>
+        <w:rFonts w:ascii="Symbol" w:hAnsi="Symbol" w:hint="default"/>
+        <w:sz w:val="20"/>
+      </w:rPr>
+    </w:lvl>
+    <w:lvl w:ilvl="1" w:tentative="1">
+      <w:start w:val="1"/>
+      <w:numFmt w:val="bullet"/>
+      <w:lvlText w:val="o"/>
+      <w:lvlJc w:val="left"/>
+      <w:pPr>
+        <w:tabs>
+          <w:tab w:val="num" w:pos="1440"/>
+        </w:tabs>
+        <w:ind w:left="1440" w:hanging="360"/>
+      </w:pPr>
+      <w:rPr>
+        <w:rFonts w:ascii="Courier New" w:hAnsi="Courier New" w:hint="default"/>
+        <w:sz w:val="20"/>
+      </w:rPr>
+    </w:lvl>
+    <w:lvl w:ilvl="2" w:tentative="1">
+      <w:start w:val="1"/>
+      <w:numFmt w:val="bullet"/>
+      <w:lvlText w:val=""/>
+      <w:lvlJc w:val="left"/>
+      <w:pPr>
+        <w:tabs>
+          <w:tab w:val="num" w:pos="2160"/>
+        </w:tabs>
+        <w:ind w:left="2160" w:hanging="360"/>
+      </w:pPr>
+      <w:rPr>
+        <w:rFonts w:ascii="Wingdings" w:hAnsi="Wingdings" w:hint="default"/>
+        <w:sz w:val="20"/>
+      </w:rPr>
+    </w:lvl>
+    <w:lvl w:ilvl="3" w:tentative="1">
+      <w:start w:val="1"/>
+      <w:numFmt w:val="bullet"/>
+      <w:lvlText w:val=""/>
+      <w:lvlJc w:val="left"/>
+      <w:pPr>
+        <w:tabs>
+          <w:tab w:val="num" w:pos="2880"/>
+        </w:tabs>
+        <w:ind w:left="2880" w:hanging="360"/>
+      </w:pPr>
+      <w:rPr>
+        <w:rFonts w:ascii="Wingdings" w:hAnsi="Wingdings" w:hint="default"/>
+        <w:sz w:val="20"/>
+      </w:rPr>
+    </w:lvl>
+    <w:lvl w:ilvl="4" w:tentative="1">
+      <w:start w:val="1"/>
+      <w:numFmt w:val="bullet"/>
+      <w:lvlText w:val=""/>
+      <w:lvlJc w:val="left"/>
+      <w:pPr>
+        <w:tabs>
+          <w:tab w:val="num" w:pos="3600"/>
+        </w:tabs>
+        <w:ind w:left="3600" w:hanging="360"/>
+      </w:pPr>
+      <w:rPr>
+        <w:rFonts w:ascii="Wingdings" w:hAnsi="Wingdings" w:hint="default"/>
+        <w:sz w:val="20"/>
+      </w:rPr>
+    </w:lvl>
+    <w:lvl w:ilvl="5" w:tentative="1">
+      <w:start w:val="1"/>
+      <w:numFmt w:val="bullet"/>
+      <w:lvlText w:val=""/>
+      <w:lvlJc w:val="left"/>
+      <w:pPr>
+        <w:tabs>
+          <w:tab w:val="num" w:pos="4320"/>
+        </w:tabs>
+        <w:ind w:left="4320" w:hanging="360"/>
+      </w:pPr>
+      <w:rPr>
+        <w:rFonts w:ascii="Wingdings" w:hAnsi="Wingdings" w:hint="default"/>
+        <w:sz w:val="20"/>
+      </w:rPr>
+    </w:lvl>
+    <w:lvl w:ilvl="6" w:tentative="1">
+      <w:start w:val="1"/>
+      <w:numFmt w:val="bullet"/>
+      <w:lvlText w:val=""/>
+      <w:lvlJc w:val="left"/>
+      <w:pPr>
+        <w:tabs>
+          <w:tab w:val="num" w:pos="5040"/>
+        </w:tabs>
+        <w:ind w:left="5040" w:hanging="360"/>
+      </w:pPr>
+      <w:rPr>
+        <w:rFonts w:ascii="Wingdings" w:hAnsi="Wingdings" w:hint="default"/>
+        <w:sz w:val="20"/>
+      </w:rPr>
+    </w:lvl>
+    <w:lvl w:ilvl="7" w:tentative="1">
+      <w:start w:val="1"/>
+      <w:numFmt w:val="bullet"/>
+      <w:lvlText w:val=""/>
+      <w:lvlJc w:val="left"/>
+      <w:pPr>
+        <w:tabs>
+          <w:tab w:val="num" w:pos="5760"/>
+        </w:tabs>
+        <w:ind w:left="5760" w:hanging="360"/>
+      </w:pPr>
+      <w:rPr>
+        <w:rFonts w:ascii="Wingdings" w:hAnsi="Wingdings" w:hint="default"/>
+        <w:sz w:val="20"/>
+      </w:rPr>
+    </w:lvl>
+    <w:lvl w:ilvl="8" w:tentative="1">
+      <w:start w:val="1"/>
+      <w:numFmt w:val="bullet"/>
+      <w:lvlText w:val=""/>
+      <w:lvlJc w:val="left"/>
+      <w:pPr>
+        <w:tabs>
+          <w:tab w:val="num" w:pos="6480"/>
+        </w:tabs>
+        <w:ind w:left="6480" w:hanging="360"/>
+      </w:pPr>
+      <w:rPr>
+        <w:rFonts w:ascii="Wingdings" w:hAnsi="Wingdings" w:hint="default"/>
+        <w:sz w:val="20"/>
+      </w:rPr>
+    </w:lvl>
+  </w:abstractNum>
+  <w:abstractNum w:abstractNumId="2" w15:restartNumberingAfterBreak="0">
     <w:nsid w:val="2F976F92"/>
     <w:multiLevelType w:val="hybridMultilevel"/>
     <w:tmpl w:val="7A8EFAF0"/>
@@ -2683,7 +3592,305 @@
       </w:rPr>
     </w:lvl>
   </w:abstractNum>
-  <w:abstractNum w:abstractNumId="1" w15:restartNumberingAfterBreak="0">
+  <w:abstractNum w:abstractNumId="3" w15:restartNumberingAfterBreak="0">
+    <w:nsid w:val="3CA301BC"/>
+    <w:multiLevelType w:val="multilevel"/>
+    <w:tmpl w:val="8F262CCC"/>
+    <w:lvl w:ilvl="0">
+      <w:start w:val="1"/>
+      <w:numFmt w:val="bullet"/>
+      <w:lvlText w:val=""/>
+      <w:lvlJc w:val="left"/>
+      <w:pPr>
+        <w:tabs>
+          <w:tab w:val="num" w:pos="720"/>
+        </w:tabs>
+        <w:ind w:left="720" w:hanging="360"/>
+      </w:pPr>
+      <w:rPr>
+        <w:rFonts w:ascii="Symbol" w:hAnsi="Symbol" w:hint="default"/>
+        <w:sz w:val="20"/>
+      </w:rPr>
+    </w:lvl>
+    <w:lvl w:ilvl="1" w:tentative="1">
+      <w:start w:val="1"/>
+      <w:numFmt w:val="bullet"/>
+      <w:lvlText w:val="o"/>
+      <w:lvlJc w:val="left"/>
+      <w:pPr>
+        <w:tabs>
+          <w:tab w:val="num" w:pos="1440"/>
+        </w:tabs>
+        <w:ind w:left="1440" w:hanging="360"/>
+      </w:pPr>
+      <w:rPr>
+        <w:rFonts w:ascii="Courier New" w:hAnsi="Courier New" w:hint="default"/>
+        <w:sz w:val="20"/>
+      </w:rPr>
+    </w:lvl>
+    <w:lvl w:ilvl="2" w:tentative="1">
+      <w:start w:val="1"/>
+      <w:numFmt w:val="bullet"/>
+      <w:lvlText w:val=""/>
+      <w:lvlJc w:val="left"/>
+      <w:pPr>
+        <w:tabs>
+          <w:tab w:val="num" w:pos="2160"/>
+        </w:tabs>
+        <w:ind w:left="2160" w:hanging="360"/>
+      </w:pPr>
+      <w:rPr>
+        <w:rFonts w:ascii="Wingdings" w:hAnsi="Wingdings" w:hint="default"/>
+        <w:sz w:val="20"/>
+      </w:rPr>
+    </w:lvl>
+    <w:lvl w:ilvl="3" w:tentative="1">
+      <w:start w:val="1"/>
+      <w:numFmt w:val="bullet"/>
+      <w:lvlText w:val=""/>
+      <w:lvlJc w:val="left"/>
+      <w:pPr>
+        <w:tabs>
+          <w:tab w:val="num" w:pos="2880"/>
+        </w:tabs>
+        <w:ind w:left="2880" w:hanging="360"/>
+      </w:pPr>
+      <w:rPr>
+        <w:rFonts w:ascii="Wingdings" w:hAnsi="Wingdings" w:hint="default"/>
+        <w:sz w:val="20"/>
+      </w:rPr>
+    </w:lvl>
+    <w:lvl w:ilvl="4" w:tentative="1">
+      <w:start w:val="1"/>
+      <w:numFmt w:val="bullet"/>
+      <w:lvlText w:val=""/>
+      <w:lvlJc w:val="left"/>
+      <w:pPr>
+        <w:tabs>
+          <w:tab w:val="num" w:pos="3600"/>
+        </w:tabs>
+        <w:ind w:left="3600" w:hanging="360"/>
+      </w:pPr>
+      <w:rPr>
+        <w:rFonts w:ascii="Wingdings" w:hAnsi="Wingdings" w:hint="default"/>
+        <w:sz w:val="20"/>
+      </w:rPr>
+    </w:lvl>
+    <w:lvl w:ilvl="5" w:tentative="1">
+      <w:start w:val="1"/>
+      <w:numFmt w:val="bullet"/>
+      <w:lvlText w:val=""/>
+      <w:lvlJc w:val="left"/>
+      <w:pPr>
+        <w:tabs>
+          <w:tab w:val="num" w:pos="4320"/>
+        </w:tabs>
+        <w:ind w:left="4320" w:hanging="360"/>
+      </w:pPr>
+      <w:rPr>
+        <w:rFonts w:ascii="Wingdings" w:hAnsi="Wingdings" w:hint="default"/>
+        <w:sz w:val="20"/>
+      </w:rPr>
+    </w:lvl>
+    <w:lvl w:ilvl="6" w:tentative="1">
+      <w:start w:val="1"/>
+      <w:numFmt w:val="bullet"/>
+      <w:lvlText w:val=""/>
+      <w:lvlJc w:val="left"/>
+      <w:pPr>
+        <w:tabs>
+          <w:tab w:val="num" w:pos="5040"/>
+        </w:tabs>
+        <w:ind w:left="5040" w:hanging="360"/>
+      </w:pPr>
+      <w:rPr>
+        <w:rFonts w:ascii="Wingdings" w:hAnsi="Wingdings" w:hint="default"/>
+        <w:sz w:val="20"/>
+      </w:rPr>
+    </w:lvl>
+    <w:lvl w:ilvl="7" w:tentative="1">
+      <w:start w:val="1"/>
+      <w:numFmt w:val="bullet"/>
+      <w:lvlText w:val=""/>
+      <w:lvlJc w:val="left"/>
+      <w:pPr>
+        <w:tabs>
+          <w:tab w:val="num" w:pos="5760"/>
+        </w:tabs>
+        <w:ind w:left="5760" w:hanging="360"/>
+      </w:pPr>
+      <w:rPr>
+        <w:rFonts w:ascii="Wingdings" w:hAnsi="Wingdings" w:hint="default"/>
+        <w:sz w:val="20"/>
+      </w:rPr>
+    </w:lvl>
+    <w:lvl w:ilvl="8" w:tentative="1">
+      <w:start w:val="1"/>
+      <w:numFmt w:val="bullet"/>
+      <w:lvlText w:val=""/>
+      <w:lvlJc w:val="left"/>
+      <w:pPr>
+        <w:tabs>
+          <w:tab w:val="num" w:pos="6480"/>
+        </w:tabs>
+        <w:ind w:left="6480" w:hanging="360"/>
+      </w:pPr>
+      <w:rPr>
+        <w:rFonts w:ascii="Wingdings" w:hAnsi="Wingdings" w:hint="default"/>
+        <w:sz w:val="20"/>
+      </w:rPr>
+    </w:lvl>
+  </w:abstractNum>
+  <w:abstractNum w:abstractNumId="4" w15:restartNumberingAfterBreak="0">
+    <w:nsid w:val="51C954B8"/>
+    <w:multiLevelType w:val="multilevel"/>
+    <w:tmpl w:val="BF406F92"/>
+    <w:lvl w:ilvl="0">
+      <w:start w:val="1"/>
+      <w:numFmt w:val="bullet"/>
+      <w:lvlText w:val=""/>
+      <w:lvlJc w:val="left"/>
+      <w:pPr>
+        <w:tabs>
+          <w:tab w:val="num" w:pos="720"/>
+        </w:tabs>
+        <w:ind w:left="720" w:hanging="360"/>
+      </w:pPr>
+      <w:rPr>
+        <w:rFonts w:ascii="Symbol" w:hAnsi="Symbol" w:hint="default"/>
+        <w:sz w:val="20"/>
+      </w:rPr>
+    </w:lvl>
+    <w:lvl w:ilvl="1" w:tentative="1">
+      <w:start w:val="1"/>
+      <w:numFmt w:val="bullet"/>
+      <w:lvlText w:val="o"/>
+      <w:lvlJc w:val="left"/>
+      <w:pPr>
+        <w:tabs>
+          <w:tab w:val="num" w:pos="1440"/>
+        </w:tabs>
+        <w:ind w:left="1440" w:hanging="360"/>
+      </w:pPr>
+      <w:rPr>
+        <w:rFonts w:ascii="Courier New" w:hAnsi="Courier New" w:hint="default"/>
+        <w:sz w:val="20"/>
+      </w:rPr>
+    </w:lvl>
+    <w:lvl w:ilvl="2" w:tentative="1">
+      <w:start w:val="1"/>
+      <w:numFmt w:val="bullet"/>
+      <w:lvlText w:val=""/>
+      <w:lvlJc w:val="left"/>
+      <w:pPr>
+        <w:tabs>
+          <w:tab w:val="num" w:pos="2160"/>
+        </w:tabs>
+        <w:ind w:left="2160" w:hanging="360"/>
+      </w:pPr>
+      <w:rPr>
+        <w:rFonts w:ascii="Wingdings" w:hAnsi="Wingdings" w:hint="default"/>
+        <w:sz w:val="20"/>
+      </w:rPr>
+    </w:lvl>
+    <w:lvl w:ilvl="3" w:tentative="1">
+      <w:start w:val="1"/>
+      <w:numFmt w:val="bullet"/>
+      <w:lvlText w:val=""/>
+      <w:lvlJc w:val="left"/>
+      <w:pPr>
+        <w:tabs>
+          <w:tab w:val="num" w:pos="2880"/>
+        </w:tabs>
+        <w:ind w:left="2880" w:hanging="360"/>
+      </w:pPr>
+      <w:rPr>
+        <w:rFonts w:ascii="Wingdings" w:hAnsi="Wingdings" w:hint="default"/>
+        <w:sz w:val="20"/>
+      </w:rPr>
+    </w:lvl>
+    <w:lvl w:ilvl="4" w:tentative="1">
+      <w:start w:val="1"/>
+      <w:numFmt w:val="bullet"/>
+      <w:lvlText w:val=""/>
+      <w:lvlJc w:val="left"/>
+      <w:pPr>
+        <w:tabs>
+          <w:tab w:val="num" w:pos="3600"/>
+        </w:tabs>
+        <w:ind w:left="3600" w:hanging="360"/>
+      </w:pPr>
+      <w:rPr>
+        <w:rFonts w:ascii="Wingdings" w:hAnsi="Wingdings" w:hint="default"/>
+        <w:sz w:val="20"/>
+      </w:rPr>
+    </w:lvl>
+    <w:lvl w:ilvl="5" w:tentative="1">
+      <w:start w:val="1"/>
+      <w:numFmt w:val="bullet"/>
+      <w:lvlText w:val=""/>
+      <w:lvlJc w:val="left"/>
+      <w:pPr>
+        <w:tabs>
+          <w:tab w:val="num" w:pos="4320"/>
+        </w:tabs>
+        <w:ind w:left="4320" w:hanging="360"/>
+      </w:pPr>
+      <w:rPr>
+        <w:rFonts w:ascii="Wingdings" w:hAnsi="Wingdings" w:hint="default"/>
+        <w:sz w:val="20"/>
+      </w:rPr>
+    </w:lvl>
+    <w:lvl w:ilvl="6" w:tentative="1">
+      <w:start w:val="1"/>
+      <w:numFmt w:val="bullet"/>
+      <w:lvlText w:val=""/>
+      <w:lvlJc w:val="left"/>
+      <w:pPr>
+        <w:tabs>
+          <w:tab w:val="num" w:pos="5040"/>
+        </w:tabs>
+        <w:ind w:left="5040" w:hanging="360"/>
+      </w:pPr>
+      <w:rPr>
+        <w:rFonts w:ascii="Wingdings" w:hAnsi="Wingdings" w:hint="default"/>
+        <w:sz w:val="20"/>
+      </w:rPr>
+    </w:lvl>
+    <w:lvl w:ilvl="7" w:tentative="1">
+      <w:start w:val="1"/>
+      <w:numFmt w:val="bullet"/>
+      <w:lvlText w:val=""/>
+      <w:lvlJc w:val="left"/>
+      <w:pPr>
+        <w:tabs>
+          <w:tab w:val="num" w:pos="5760"/>
+        </w:tabs>
+        <w:ind w:left="5760" w:hanging="360"/>
+      </w:pPr>
+      <w:rPr>
+        <w:rFonts w:ascii="Wingdings" w:hAnsi="Wingdings" w:hint="default"/>
+        <w:sz w:val="20"/>
+      </w:rPr>
+    </w:lvl>
+    <w:lvl w:ilvl="8" w:tentative="1">
+      <w:start w:val="1"/>
+      <w:numFmt w:val="bullet"/>
+      <w:lvlText w:val=""/>
+      <w:lvlJc w:val="left"/>
+      <w:pPr>
+        <w:tabs>
+          <w:tab w:val="num" w:pos="6480"/>
+        </w:tabs>
+        <w:ind w:left="6480" w:hanging="360"/>
+      </w:pPr>
+      <w:rPr>
+        <w:rFonts w:ascii="Wingdings" w:hAnsi="Wingdings" w:hint="default"/>
+        <w:sz w:val="20"/>
+      </w:rPr>
+    </w:lvl>
+  </w:abstractNum>
+  <w:abstractNum w:abstractNumId="5" w15:restartNumberingAfterBreak="0">
     <w:nsid w:val="62564637"/>
     <w:multiLevelType w:val="hybridMultilevel"/>
     <w:tmpl w:val="8130753E"/>
@@ -2800,10 +4007,22 @@
     </w:lvl>
   </w:abstractNum>
   <w:num w:numId="1">
-    <w:abstractNumId w:val="1"/>
+    <w:abstractNumId w:val="5"/>
   </w:num>
   <w:num w:numId="2">
+    <w:abstractNumId w:val="2"/>
+  </w:num>
+  <w:num w:numId="3">
+    <w:abstractNumId w:val="3"/>
+  </w:num>
+  <w:num w:numId="4">
+    <w:abstractNumId w:val="4"/>
+  </w:num>
+  <w:num w:numId="5">
     <w:abstractNumId w:val="0"/>
+  </w:num>
+  <w:num w:numId="6">
+    <w:abstractNumId w:val="1"/>
   </w:num>
 </w:numbering>
 </file>
@@ -3205,7 +4424,7 @@
   <w:style w:type="paragraph" w:default="1" w:styleId="Normal">
     <w:name w:val="Normal"/>
     <w:qFormat/>
-    <w:rsid w:val="00B3150B"/>
+    <w:rsid w:val="009165A6"/>
   </w:style>
   <w:style w:type="character" w:default="1" w:styleId="DefaultParagraphFont">
     <w:name w:val="Default Paragraph Font"/>
@@ -3301,6 +4520,31 @@
     <w:name w:val="whitespace-normal"/>
     <w:basedOn w:val="DefaultParagraphFont"/>
     <w:rsid w:val="003835EE"/>
+  </w:style>
+  <w:style w:type="paragraph" w:customStyle="1" w:styleId="pdq2pgselectionanchorcontainer">
+    <w:name w:val="pdq2pg_selectionanchorcontainer"/>
+    <w:basedOn w:val="Normal"/>
+    <w:rsid w:val="00A86B73"/>
+    <w:pPr>
+      <w:spacing w:before="100" w:beforeAutospacing="1" w:after="100" w:afterAutospacing="1" w:line="240" w:lineRule="auto"/>
+    </w:pPr>
+    <w:rPr>
+      <w:rFonts w:ascii="Times New Roman" w:eastAsia="Times New Roman" w:hAnsi="Times New Roman" w:cs="Times New Roman"/>
+      <w:sz w:val="24"/>
+      <w:szCs w:val="24"/>
+      <w:lang w:eastAsia="en-ID"/>
+    </w:rPr>
+  </w:style>
+  <w:style w:type="character" w:styleId="Strong">
+    <w:name w:val="Strong"/>
+    <w:basedOn w:val="DefaultParagraphFont"/>
+    <w:uiPriority w:val="22"/>
+    <w:qFormat/>
+    <w:rsid w:val="00A86B73"/>
+    <w:rPr>
+      <w:b/>
+      <w:bCs/>
+    </w:rPr>
   </w:style>
 </w:styles>
 </file>

</xml_diff>